<commit_message>
Let Construct designate color, fluorescence, and DNA methods, and show Register only after a construct exists.
Co-authored-by: Cursor <cursoragent@cursor.com>
</commit_message>
<xml_diff>
--- a/docs/Antibody-user.docx
+++ b/docs/Antibody-user.docx
@@ -385,6 +385,11 @@
       </w:r>
     </w:p>
     <w:p>
+      <w:r>
+        <w:t xml:space="preserve">The left column also designates how those constructs are kept and checked. Color covers chromogenic screening, such as blue/white lacZα, GUS, XylE, chromoproteins, the carotenoid pathway, and yeast ade2 red/white. Fluorescence covers a GFP, sfGFP, or mCherry fusion, split GFP, FACS, FlAsH/ReAsH, and an IRES or 2A-linked fluorescent protein. DNA selection covers the genetic markers (bacterial antibiotics, mammalian antibiotics, auxotrophy, DHFR, glutamine synthetase, counterselection, and antibiotic-free systems) and the checks that confirm the plasmid (colony PCR, a diagnostic digest, Sanger sequencing, and full-plasmid sequencing). Color and fluorescence screen colonies that all grow. A marker selects. The DNA checks confirm and do not select. The catalog facet named Selection marker still filters plasmids by the antibiotic already on them.</w:t>
+      </w:r>
+    </w:p>
+    <w:p>
       <w:pPr>
         <w:pStyle w:val="Heading1"/>
       </w:pPr>
@@ -587,7 +592,7 @@
         </w:numPr>
       </w:pPr>
       <w:r>
-        <w:t xml:space="preserve">Register constructs stores this panel with the expression choice. The button stays off until a target class, a host, a codon table, a codon method, and transient or stable are all set, and until a construct is included. Hover the button to see what is still missing. Registering the same constructs with the same choice again leaves the button on Registered.</w:t>
+        <w:t xml:space="preserve">Register constructs appears on the Construct tab after you choose how many constructs to express with and that choice produces constructs. It stays off Request, Chain, Variable regions, Mutations, and Expression. On Construct it stays disabled until a target class, a host, a codon table, a codon method, and transient or stable are all set. Hover the button to see what is still missing. Registering the same constructs with the same choice again leaves the button on Registered.</w:t>
       </w:r>
     </w:p>
     <w:p>
@@ -727,7 +732,7 @@
         </w:numPr>
       </w:pPr>
       <w:r>
-        <w:t xml:space="preserve">On Construct, choose how many constructs to express with.</w:t>
+        <w:t xml:space="preserve">On Construct, choose how many constructs to express with, then register them.</w:t>
       </w:r>
     </w:p>
     <w:p>

</xml_diff>